<commit_message>
Rebuild bundled @instadocs/core (agentic ADD path)
</commit_message>
<xml_diff>
--- a/node_modules/@instadocs/core/assets/sdd-template.docx
+++ b/node_modules/@instadocs/core/assets/sdd-template.docx
@@ -93,7 +93,7 @@
                                 <w:color w:val="auto"/>
                                 <w:spacing w:val="0"/>
                               </w:rPr>
-                              <w:t>{</w:t>
+                              <w:t/>
                             </w:r>
                             <w:r>
                               <w:rPr>
@@ -101,7 +101,7 @@
                                 <w:color w:val="auto"/>
                                 <w:spacing w:val="0"/>
                               </w:rPr>
-                              <w:t>PROCESS NAME</w:t>
+                              <w:t>[[projectName]]</w:t>
                             </w:r>
                             <w:r>
                               <w:rPr>
@@ -109,7 +109,7 @@
                                 <w:color w:val="auto"/>
                                 <w:spacing w:val="0"/>
                               </w:rPr>
-                              <w:t>}</w:t>
+                              <w:t/>
                             </w:r>
                             <w:r>
                               <w:rPr>
@@ -138,7 +138,7 @@
                               <w:rPr>
                                 <w:rStyle w:val="SubtleEmphasis"/>
                               </w:rPr>
-                              <w:t>{Description}</w:t>
+                              <w:t>[[coverDescription]]</w:t>
                             </w:r>
                           </w:p>
                         </w:txbxContent>
@@ -209,7 +209,7 @@
                           <w:color w:val="auto"/>
                           <w:spacing w:val="0"/>
                         </w:rPr>
-                        <w:t>{</w:t>
+                        <w:t/>
                       </w:r>
                       <w:r>
                         <w:rPr>
@@ -217,7 +217,7 @@
                           <w:color w:val="auto"/>
                           <w:spacing w:val="0"/>
                         </w:rPr>
-                        <w:t>PROCESS NAME</w:t>
+                        <w:t>[[projectName]]</w:t>
                       </w:r>
                       <w:r>
                         <w:rPr>
@@ -225,7 +225,7 @@
                           <w:color w:val="auto"/>
                           <w:spacing w:val="0"/>
                         </w:rPr>
-                        <w:t>}</w:t>
+                        <w:t/>
                       </w:r>
                       <w:r>
                         <w:rPr>
@@ -254,7 +254,7 @@
                         <w:rPr>
                           <w:rStyle w:val="SubtleEmphasis"/>
                         </w:rPr>
-                        <w:t>{Description}</w:t>
+                        <w:t>[[coverDescription]]</w:t>
                       </w:r>
                     </w:p>
                   </w:txbxContent>
@@ -5172,7 +5172,7 @@
         <w:t/>
       </w:r>
       <w:r>
-        <w:t xml:space="preserve"> </w:t>
+        <w:t xml:space="preserve"/>
       </w:r>
       <w:r>
         <w:t/>
@@ -5630,6 +5630,51 @@
     <w:p>
       <w:pPr>
         <w:rPr>
+          <w:sz w:val="2"/>
+        </w:rPr>
+      </w:pPr>
+      <w:r>
+        <w:t xml:space="preserve">[[#architecturePoints]]</w:t>
+      </w:r>
+    </w:p>
+    <w:p>
+      <w:pPr>
+        <w:pStyle w:val="ListParagraph"/>
+        <w:numPr>
+          <w:ilvl w:val="0"/>
+          <w:numId w:val="1"/>
+        </w:numPr>
+        <w:rPr>
+          <w:sz w:val="20"/>
+        </w:rPr>
+      </w:pPr>
+      <w:r>
+        <w:rPr>
+          <w:b/>
+          <w:sz w:val="20"/>
+        </w:rPr>
+        <w:t xml:space="preserve">[[aspect]]</w:t>
+      </w:r>
+      <w:r>
+        <w:rPr>
+          <w:sz w:val="20"/>
+        </w:rPr>
+        <w:t xml:space="preserve">: [[detail]]</w:t>
+      </w:r>
+    </w:p>
+    <w:p>
+      <w:pPr>
+        <w:rPr>
+          <w:sz w:val="2"/>
+        </w:rPr>
+      </w:pPr>
+      <w:r>
+        <w:t xml:space="preserve">[[/architecturePoints]]</w:t>
+      </w:r>
+    </w:p>
+    <w:p>
+      <w:pPr>
+        <w:rPr>
           <w:i/>
           <w:sz w:val="18"/>
         </w:rPr>
@@ -5685,7 +5730,7 @@
         <w:rPr>
           <w:rFonts w:eastAsia="Arial Unicode MS"/>
         </w:rPr>
-        <w:t>The listed applications and shared path/storage listed below are essential for the process and need to be granted access to.</w:t>
+        <w:t/>
       </w:r>
       <w:r>
         <w:rPr>
@@ -6938,13 +6983,13 @@
         <w:t/>
       </w:r>
       <w:r>
-        <w:t xml:space="preserve">The below table includes details on the process name, the folder path (modern folders) and a </w:t>
-      </w:r>
-      <w:r>
-        <w:t>brief description</w:t>
-      </w:r>
-      <w:r>
-        <w:t xml:space="preserve"> of </w:t>
+        <w:t xml:space="preserve"/>
+      </w:r>
+      <w:r>
+        <w:t/>
+      </w:r>
+      <w:r>
+        <w:t xml:space="preserve"/>
       </w:r>
       <w:r>
         <w:t/>
@@ -7227,7 +7272,7 @@
         <w:t xml:space="preserve"/>
       </w:r>
       <w:r>
-        <w:t>of the respective process and corresponding folder path</w:t>
+        <w:t/>
       </w:r>
       <w:r>
         <w:t/>
@@ -7654,7 +7699,22 @@
     </w:p>
     <w:p>
       <w:pPr>
-        <w:spacing w:line="240" w:lineRule="auto"/>
+        <w:rPr>
+          <w:sz w:val="2"/>
+        </w:rPr>
+      </w:pPr>
+      <w:r>
+        <w:t xml:space="preserve">[[#designSpecifications]]</w:t>
+      </w:r>
+    </w:p>
+    <w:p>
+      <w:pPr>
+        <w:pStyle w:val="ListParagraph"/>
+        <w:numPr>
+          <w:ilvl w:val="0"/>
+          <w:numId w:val="1"/>
+        </w:numPr>
+        <w:spacing w:after="40" w:line="240" w:lineRule="auto"/>
         <w:rPr>
           <w:sz w:val="20"/>
         </w:rPr>
@@ -7663,7 +7723,17 @@
         <w:rPr>
           <w:sz w:val="20"/>
         </w:rPr>
-        <w:t xml:space="preserve">[[designSpecifications]]</w:t>
+        <w:t xml:space="preserve">[[.]]</w:t>
+      </w:r>
+    </w:p>
+    <w:p>
+      <w:pPr>
+        <w:rPr>
+          <w:sz w:val="2"/>
+        </w:rPr>
+      </w:pPr>
+      <w:r>
+        <w:t xml:space="preserve">[[/designSpecifications]]</w:t>
       </w:r>
     </w:p>
     <w:p>
@@ -8018,323 +8088,53 @@
     <w:p>
       <w:pPr>
         <w:rPr>
-          <w:rFonts w:eastAsia="Arial Unicode MS"/>
-        </w:rPr>
-      </w:pPr>
-    </w:p>
-    <w:p>
-      <w:pPr>
-        <w:rPr>
-          <w:rFonts w:eastAsia="Arial Unicode MS"/>
-        </w:rPr>
-      </w:pPr>
-      <w:r>
-        <w:rPr>
-          <w:rFonts w:eastAsia="Arial Unicode MS"/>
-        </w:rPr>
-        <w:t/>
-      </w:r>
-      <w:r>
-        <w:rPr>
-          <w:rFonts w:eastAsia="Arial Unicode MS"/>
-        </w:rPr>
-        <w:t xml:space="preserve"> queue that is to be used. For </w:t>
-      </w:r>
-      <w:r>
-        <w:rPr>
-          <w:rFonts w:eastAsia="Arial Unicode MS"/>
-        </w:rPr>
-        <w:t>Example:</w:t>
-      </w:r>
-      <w:r>
-        <w:rPr>
-          <w:rFonts w:eastAsia="Arial Unicode MS"/>
-        </w:rPr>
-        <w:t xml:space="preserve"> Business queue, </w:t>
-      </w:r>
-      <w:r>
-        <w:rPr>
-          <w:rFonts w:eastAsia="Arial Unicode MS"/>
-        </w:rPr>
-        <w:t>reporting</w:t>
-      </w:r>
-      <w:r>
-        <w:rPr>
-          <w:rFonts w:eastAsia="Arial Unicode MS"/>
-        </w:rPr>
-        <w:t xml:space="preserve"> queue, Retraining queue etc.</w:t>
-      </w:r>
-      <w:r>
-        <w:rPr>
-          <w:rFonts w:eastAsia="Arial Unicode MS"/>
-        </w:rPr>
-        <w:t xml:space="preserve"> See sample below</w:t>
-      </w:r>
-      <w:r>
-        <w:rPr>
-          <w:rFonts w:eastAsia="Arial Unicode MS"/>
-        </w:rPr>
-        <w:t/>
-      </w:r>
-    </w:p>
-    <w:p>
-      <w:pPr>
-        <w:rPr>
-          <w:rFonts w:eastAsia="Arial Unicode MS"/>
-        </w:rPr>
-      </w:pPr>
-      <w:r>
-        <w:rPr>
-          <w:rFonts w:eastAsia="Arial Unicode MS"/>
-        </w:rPr>
-        <w:t>{</w:t>
-      </w:r>
-    </w:p>
-    <w:p>
-      <w:pPr>
-        <w:rPr>
-          <w:rFonts w:eastAsia="Arial Unicode MS"/>
-        </w:rPr>
-      </w:pPr>
-      <w:r>
-        <w:rPr>
-          <w:rFonts w:eastAsia="Arial Unicode MS"/>
-        </w:rPr>
-        <w:t xml:space="preserve">  "</w:t>
-      </w:r>
-      <w:proofErr w:type="spellStart"/>
-      <w:r>
-        <w:rPr>
-          <w:rFonts w:eastAsia="Arial Unicode MS"/>
-        </w:rPr>
-        <w:t>QueueItemID</w:t>
-      </w:r>
-      <w:proofErr w:type="spellEnd"/>
-      <w:r>
-        <w:rPr>
-          <w:rFonts w:eastAsia="Arial Unicode MS"/>
-        </w:rPr>
-        <w:t>": "123456789",</w:t>
-      </w:r>
-    </w:p>
-    <w:p>
-      <w:pPr>
-        <w:rPr>
-          <w:rFonts w:eastAsia="Arial Unicode MS"/>
-        </w:rPr>
-      </w:pPr>
-      <w:r>
-        <w:rPr>
-          <w:rFonts w:eastAsia="Arial Unicode MS"/>
-        </w:rPr>
-        <w:t xml:space="preserve">  "</w:t>
-      </w:r>
-      <w:proofErr w:type="spellStart"/>
-      <w:r>
-        <w:rPr>
-          <w:rFonts w:eastAsia="Arial Unicode MS"/>
-        </w:rPr>
-        <w:t>ProcessName</w:t>
-      </w:r>
-      <w:proofErr w:type="spellEnd"/>
-      <w:r>
-        <w:rPr>
-          <w:rFonts w:eastAsia="Arial Unicode MS"/>
-        </w:rPr>
-        <w:t>": "Process1",</w:t>
-      </w:r>
-    </w:p>
-    <w:p>
-      <w:pPr>
-        <w:rPr>
-          <w:rFonts w:eastAsia="Arial Unicode MS"/>
-        </w:rPr>
-      </w:pPr>
-      <w:r>
-        <w:rPr>
-          <w:rFonts w:eastAsia="Arial Unicode MS"/>
-        </w:rPr>
-        <w:t xml:space="preserve">  "Priority": "High",</w:t>
-      </w:r>
-    </w:p>
-    <w:p>
-      <w:pPr>
-        <w:rPr>
-          <w:rFonts w:eastAsia="Arial Unicode MS"/>
-        </w:rPr>
-      </w:pPr>
-      <w:r>
-        <w:rPr>
-          <w:rFonts w:eastAsia="Arial Unicode MS"/>
-        </w:rPr>
-        <w:t xml:space="preserve">  "Status": "New",</w:t>
-      </w:r>
-    </w:p>
-    <w:p>
-      <w:pPr>
-        <w:rPr>
-          <w:rFonts w:eastAsia="Arial Unicode MS"/>
-        </w:rPr>
-      </w:pPr>
-      <w:r>
-        <w:rPr>
-          <w:rFonts w:eastAsia="Arial Unicode MS"/>
-        </w:rPr>
-        <w:t xml:space="preserve">  "</w:t>
-      </w:r>
-      <w:proofErr w:type="spellStart"/>
-      <w:r>
-        <w:rPr>
-          <w:rFonts w:eastAsia="Arial Unicode MS"/>
-        </w:rPr>
-        <w:t>DueDate</w:t>
-      </w:r>
-      <w:proofErr w:type="spellEnd"/>
-      <w:r>
-        <w:rPr>
-          <w:rFonts w:eastAsia="Arial Unicode MS"/>
-        </w:rPr>
-        <w:t>": "2024-04-10",</w:t>
-      </w:r>
-    </w:p>
-    <w:p>
-      <w:pPr>
-        <w:rPr>
-          <w:rFonts w:eastAsia="Arial Unicode MS"/>
-        </w:rPr>
-      </w:pPr>
-      <w:r>
-        <w:rPr>
-          <w:rFonts w:eastAsia="Arial Unicode MS"/>
-        </w:rPr>
-        <w:t xml:space="preserve">  "</w:t>
-      </w:r>
-      <w:proofErr w:type="spellStart"/>
-      <w:r>
-        <w:rPr>
-          <w:rFonts w:eastAsia="Arial Unicode MS"/>
-        </w:rPr>
-        <w:t>CreatedOn</w:t>
-      </w:r>
-      <w:proofErr w:type="spellEnd"/>
-      <w:r>
-        <w:rPr>
-          <w:rFonts w:eastAsia="Arial Unicode MS"/>
-        </w:rPr>
-        <w:t>": "2024-04-01T08:00:00",</w:t>
-      </w:r>
-    </w:p>
-    <w:p>
-      <w:pPr>
-        <w:rPr>
-          <w:rFonts w:eastAsia="Arial Unicode MS"/>
-        </w:rPr>
-      </w:pPr>
-      <w:r>
-        <w:rPr>
-          <w:rFonts w:eastAsia="Arial Unicode MS"/>
-        </w:rPr>
-        <w:t xml:space="preserve">  "</w:t>
-      </w:r>
-      <w:proofErr w:type="spellStart"/>
-      <w:r>
-        <w:rPr>
-          <w:rFonts w:eastAsia="Arial Unicode MS"/>
-        </w:rPr>
-        <w:t>CreatedBy</w:t>
-      </w:r>
-      <w:proofErr w:type="spellEnd"/>
-      <w:r>
-        <w:rPr>
-          <w:rFonts w:eastAsia="Arial Unicode MS"/>
-        </w:rPr>
-        <w:t/>
-      </w:r>
-    </w:p>
-    <w:p>
-      <w:pPr>
-        <w:rPr>
-          <w:rFonts w:eastAsia="Arial Unicode MS"/>
-        </w:rPr>
-      </w:pPr>
-      <w:r>
-        <w:rPr>
-          <w:rFonts w:eastAsia="Arial Unicode MS"/>
-        </w:rPr>
-        <w:t xml:space="preserve">  "Data</w:t>
-      </w:r>
-      <w:proofErr w:type="gramStart"/>
-      <w:r>
-        <w:rPr>
-          <w:rFonts w:eastAsia="Arial Unicode MS"/>
-        </w:rPr>
-        <w:t>": {</w:t>
-      </w:r>
-      <w:proofErr w:type="gramEnd"/>
-    </w:p>
-    <w:p>
-      <w:pPr>
-        <w:rPr>
-          <w:rFonts w:eastAsia="Arial Unicode MS"/>
-        </w:rPr>
-      </w:pPr>
-      <w:r>
-        <w:rPr>
-          <w:rFonts w:eastAsia="Arial Unicode MS"/>
-        </w:rPr>
-        <w:t xml:space="preserve">    "Field1": "Value1",</w:t>
-      </w:r>
-    </w:p>
-    <w:p>
-      <w:pPr>
-        <w:rPr>
-          <w:rFonts w:eastAsia="Arial Unicode MS"/>
-        </w:rPr>
-      </w:pPr>
-      <w:r>
-        <w:rPr>
-          <w:rFonts w:eastAsia="Arial Unicode MS"/>
-        </w:rPr>
-        <w:t xml:space="preserve">    "Field2": "Value2",</w:t>
-      </w:r>
-    </w:p>
-    <w:p>
-      <w:pPr>
-        <w:rPr>
-          <w:rFonts w:eastAsia="Arial Unicode MS"/>
-        </w:rPr>
-      </w:pPr>
-      <w:r>
-        <w:rPr>
-          <w:rFonts w:eastAsia="Arial Unicode MS"/>
-        </w:rPr>
-        <w:t xml:space="preserve">    "Field3": "Value3"</w:t>
-      </w:r>
-    </w:p>
-    <w:p>
-      <w:pPr>
-        <w:rPr>
-          <w:rFonts w:eastAsia="Arial Unicode MS"/>
-        </w:rPr>
-      </w:pPr>
-      <w:r>
-        <w:rPr>
-          <w:rFonts w:eastAsia="Arial Unicode MS"/>
-        </w:rPr>
-        <w:t xml:space="preserve">  }</w:t>
-      </w:r>
-    </w:p>
-    <w:p>
-      <w:pPr>
-        <w:rPr>
-          <w:rFonts w:eastAsia="Arial Unicode MS"/>
-        </w:rPr>
-      </w:pPr>
-      <w:r>
-        <w:rPr>
-          <w:rFonts w:eastAsia="Arial Unicode MS"/>
-        </w:rPr>
-        <w:t>}</w:t>
+          <w:sz w:val="2"/>
+        </w:rPr>
+      </w:pPr>
+      <w:r>
+        <w:t xml:space="preserve">[[#hasQueueItem]]</w:t>
+      </w:r>
+    </w:p>
+    <w:p>
+      <w:pPr>
+        <w:spacing w:before="120"/>
+        <w:rPr>
+          <w:i/>
+          <w:sz w:val="18"/>
+        </w:rPr>
+      </w:pPr>
+      <w:r>
+        <w:rPr>
+          <w:i/>
+          <w:sz w:val="18"/>
+        </w:rPr>
+        <w:t xml:space="preserve">Representative queue item uploaded to Orchestrator (from Add/Bulk Add Queue Item):</w:t>
+      </w:r>
+    </w:p>
+    <w:p>
+      <w:pPr>
+        <w:spacing w:after="0" w:line="240" w:lineRule="auto"/>
+        <w:rPr>
+          <w:rFonts w:ascii="Consolas" w:hAnsi="Consolas" w:cs="Consolas"/>
+          <w:sz w:val="16"/>
+        </w:rPr>
+      </w:pPr>
+      <w:r>
+        <w:rPr>
+          <w:rFonts w:ascii="Consolas" w:hAnsi="Consolas" w:cs="Consolas"/>
+          <w:sz w:val="16"/>
+        </w:rPr>
+        <w:t xml:space="preserve">[[queueItemJson]]</w:t>
+      </w:r>
+    </w:p>
+    <w:p>
+      <w:pPr>
+        <w:rPr>
+          <w:sz w:val="2"/>
+        </w:rPr>
+      </w:pPr>
+      <w:r>
+        <w:t xml:space="preserve">[[/hasQueueItem]]</w:t>
       </w:r>
     </w:p>
     <w:p>
@@ -8360,124 +8160,16 @@
     </w:p>
     <w:p>
       <w:pPr>
-        <w:rPr>
-          <w:rFonts w:eastAsia="Arial Unicode MS"/>
-        </w:rPr>
-      </w:pPr>
-      <w:r>
-        <w:rPr>
-          <w:rFonts w:eastAsia="Arial Unicode MS"/>
-        </w:rPr>
-        <w:t/>
-      </w:r>
-      <w:r>
-        <w:rPr>
-          <w:rFonts w:eastAsia="Arial Unicode MS"/>
-        </w:rPr>
-        <w:t xml:space="preserve">Process design is the approach towards how the packages are developed based on the functional requirements. It has a flow swim lane diagram and the requirements that </w:t>
-      </w:r>
-      <w:proofErr w:type="gramStart"/>
-      <w:r>
-        <w:rPr>
-          <w:rFonts w:eastAsia="Arial Unicode MS"/>
-        </w:rPr>
-        <w:t>broken</w:t>
-      </w:r>
-      <w:proofErr w:type="gramEnd"/>
-      <w:r>
-        <w:rPr>
-          <w:rFonts w:eastAsia="Arial Unicode MS"/>
-        </w:rPr>
-        <w:t xml:space="preserve"> down into modules exhibit </w:t>
-      </w:r>
-      <w:proofErr w:type="gramStart"/>
-      <w:r>
-        <w:rPr>
-          <w:rFonts w:eastAsia="Arial Unicode MS"/>
-        </w:rPr>
-        <w:t>the BOT</w:t>
-      </w:r>
-      <w:proofErr w:type="gramEnd"/>
-      <w:r>
-        <w:rPr>
-          <w:rFonts w:eastAsia="Arial Unicode MS"/>
-        </w:rPr>
-        <w:t xml:space="preserve"> behavior on each functionality basis. All flowcharts indicate the control flow and retry mechanisms that will be implemented.</w:t>
-      </w:r>
-      <w:r>
-        <w:rPr>
-          <w:rFonts w:eastAsia="Arial Unicode MS"/>
-        </w:rPr>
-        <w:t/>
-      </w:r>
-    </w:p>
-    <w:p>
-      <w:pPr>
-        <w:rPr>
-          <w:rFonts w:eastAsia="Arial Unicode MS"/>
-        </w:rPr>
-      </w:pPr>
-      <w:r>
-        <w:object w:dxaOrig="12075" w:dyaOrig="9526" w14:anchorId="31FBC5BD">
-          <v:shape id="_x0000_i1027" type="#_x0000_t75" style="width:436.5pt;height:344.25pt" o:ole="">
-            <v:imagedata r:id="rId17" o:title=""/>
-          </v:shape>
-          <o:OLEObject Type="Embed" ProgID="Visio.Drawing.15" ShapeID="_x0000_i1027" DrawAspect="Content" ObjectID="_1814626461" r:id="rId18"/>
-        </w:object>
-      </w:r>
-    </w:p>
-    <w:p/>
-    <w:p>
-      <w:pPr>
-        <w:rPr>
-          <w:rFonts w:eastAsia="Arial Unicode MS"/>
-        </w:rPr>
-      </w:pPr>
-      <w:r>
-        <w:t/>
-      </w:r>
-      <w:r>
-        <w:t xml:space="preserve">The above swim-lane diagram shows a </w:t>
-      </w:r>
-      <w:r>
-        <w:t xml:space="preserve">typical RE Framework that fits </w:t>
-      </w:r>
-      <w:r>
-        <w:t xml:space="preserve">a transactional processing of items from a queue and is scalable to multiple Bots. </w:t>
-      </w:r>
-      <w:r>
-        <w:t xml:space="preserve">It is divided into subprocesses that </w:t>
-      </w:r>
-      <w:proofErr w:type="gramStart"/>
-      <w:r>
-        <w:t>gets</w:t>
-      </w:r>
-      <w:proofErr w:type="gramEnd"/>
-      <w:r>
-        <w:t xml:space="preserve"> called </w:t>
-      </w:r>
-      <w:proofErr w:type="gramStart"/>
-      <w:r>
-        <w:t>over and over</w:t>
-      </w:r>
-      <w:proofErr w:type="gramEnd"/>
-      <w:r>
-        <w:t xml:space="preserve"> for every item.</w:t>
-      </w:r>
-      <w:r>
-        <w:t xml:space="preserve"> </w:t>
-      </w:r>
-      <w:r>
-        <w:t xml:space="preserve">A, B and C are </w:t>
-      </w:r>
-      <w:r>
-        <w:t>sub process modularized and can/should be added as a different diagram</w:t>
-      </w:r>
-      <w:r>
-        <w:t xml:space="preserve"> for compartmentalization</w:t>
-      </w:r>
-      <w:r>
-        <w:t/>
+        <w:spacing w:line="240" w:lineRule="auto"/>
+        <w:rPr>
+          <w:sz w:val="20"/>
+        </w:rPr>
+      </w:pPr>
+      <w:r>
+        <w:rPr>
+          <w:sz w:val="20"/>
+        </w:rPr>
+        <w:t xml:space="preserve">This section describes how the solution is structured into reusable modules and its high-level process flow, including control flow, exception handling and retry mechanisms.</w:t>
       </w:r>
     </w:p>
     <w:p>
@@ -8492,36 +8184,12 @@
     </w:p>
     <w:p>
       <w:pPr>
-        <w:spacing w:line="240" w:lineRule="auto"/>
-        <w:rPr>
-          <w:sz w:val="20"/>
-        </w:rPr>
-      </w:pPr>
-      <w:r>
-        <w:rPr>
-          <w:sz w:val="20"/>
-        </w:rPr>
-        <w:t xml:space="preserve">[[designConsiderations]]</w:t>
-      </w:r>
-    </w:p>
-    <w:p>
-      <w:pPr>
-        <w:pStyle w:val="Heading2"/>
-      </w:pPr>
-      <w:bookmarkStart w:id="27" w:name="_Toc204013709"/>
-      <w:r>
-        <w:t>Naming conventions</w:t>
-      </w:r>
-      <w:bookmarkEnd w:id="27"/>
-    </w:p>
-    <w:p>
-      <w:pPr>
         <w:rPr>
           <w:sz w:val="2"/>
         </w:rPr>
       </w:pPr>
       <w:r>
-        <w:t xml:space="preserve">[[#namingConventions]]</w:t>
+        <w:t xml:space="preserve">[[#designConsiderations]]</w:t>
       </w:r>
     </w:p>
     <w:p>
@@ -8531,6 +8199,55 @@
           <w:ilvl w:val="0"/>
           <w:numId w:val="1"/>
         </w:numPr>
+        <w:spacing w:after="40" w:line="240" w:lineRule="auto"/>
+        <w:rPr>
+          <w:sz w:val="20"/>
+        </w:rPr>
+      </w:pPr>
+      <w:r>
+        <w:rPr>
+          <w:sz w:val="20"/>
+        </w:rPr>
+        <w:t xml:space="preserve">[[.]]</w:t>
+      </w:r>
+    </w:p>
+    <w:p>
+      <w:pPr>
+        <w:rPr>
+          <w:sz w:val="2"/>
+        </w:rPr>
+      </w:pPr>
+      <w:r>
+        <w:t xml:space="preserve">[[/designConsiderations]]</w:t>
+      </w:r>
+    </w:p>
+    <w:p>
+      <w:pPr>
+        <w:pStyle w:val="Heading2"/>
+      </w:pPr>
+      <w:bookmarkStart w:id="27" w:name="_Toc204013709"/>
+      <w:r>
+        <w:t>Naming conventions</w:t>
+      </w:r>
+      <w:bookmarkEnd w:id="27"/>
+    </w:p>
+    <w:p>
+      <w:pPr>
+        <w:rPr>
+          <w:sz w:val="2"/>
+        </w:rPr>
+      </w:pPr>
+      <w:r>
+        <w:t xml:space="preserve">[[#namingConventions]]</w:t>
+      </w:r>
+    </w:p>
+    <w:p>
+      <w:pPr>
+        <w:pStyle w:val="ListParagraph"/>
+        <w:numPr>
+          <w:ilvl w:val="0"/>
+          <w:numId w:val="1"/>
+        </w:numPr>
         <w:rPr>
           <w:sz w:val="20"/>
         </w:rPr>
@@ -8569,21 +8286,21 @@
         <w:t xml:space="preserve"/>
       </w:r>
       <w:r>
-        <w:t>space is dedicated for the module/</w:t>
+        <w:t/>
       </w:r>
       <w:proofErr w:type="spellStart"/>
       <w:r>
-        <w:t>xaml</w:t>
+        <w:t/>
       </w:r>
       <w:proofErr w:type="spellEnd"/>
       <w:r>
-        <w:t xml:space="preserve"> workflow breakup, the wrappers or parent xamls </w:t>
-      </w:r>
-      <w:r>
-        <w:t xml:space="preserve">that invoke the child modules and the overall </w:t>
-      </w:r>
-      <w:r>
-        <w:t>design specifications of a process</w:t>
+        <w:t xml:space="preserve"/>
+      </w:r>
+      <w:r>
+        <w:t xml:space="preserve"/>
+      </w:r>
+      <w:r>
+        <w:t/>
       </w:r>
       <w:r>
         <w:t/>
@@ -9100,6 +8817,29 @@
     </w:p>
     <w:p>
       <w:pPr>
+        <w:rPr>
+          <w:i/>
+          <w:sz w:val="18"/>
+        </w:rPr>
+      </w:pPr>
+      <w:r>
+        <w:rPr>
+          <w:i/>
+          <w:sz w:val="18"/>
+        </w:rPr>
+        <w:t xml:space="preserve">Per-process high-level flows:</w:t>
+      </w:r>
+    </w:p>
+    <w:p>
+      <w:pPr>
+        <w:jc w:val="center"/>
+      </w:pPr>
+      <w:r>
+        <w:t xml:space="preserve">INSTADOCS_FLOWCHART_PROJECTS</w:t>
+      </w:r>
+    </w:p>
+    <w:p>
+      <w:pPr>
         <w:pStyle w:val="Heading2"/>
       </w:pPr>
       <w:bookmarkStart w:id="30" w:name="_Toc204013712"/>
@@ -9110,7 +8850,22 @@
     </w:p>
     <w:p>
       <w:pPr>
-        <w:spacing w:line="240" w:lineRule="auto"/>
+        <w:rPr>
+          <w:sz w:val="2"/>
+        </w:rPr>
+      </w:pPr>
+      <w:r>
+        <w:t xml:space="preserve">[[#reporting]]</w:t>
+      </w:r>
+    </w:p>
+    <w:p>
+      <w:pPr>
+        <w:pStyle w:val="ListParagraph"/>
+        <w:numPr>
+          <w:ilvl w:val="0"/>
+          <w:numId w:val="1"/>
+        </w:numPr>
+        <w:spacing w:after="40" w:line="240" w:lineRule="auto"/>
         <w:rPr>
           <w:sz w:val="20"/>
         </w:rPr>
@@ -9119,7 +8874,17 @@
         <w:rPr>
           <w:sz w:val="20"/>
         </w:rPr>
-        <w:t xml:space="preserve">[[reporting]]</w:t>
+        <w:t xml:space="preserve">[[.]]</w:t>
+      </w:r>
+    </w:p>
+    <w:p>
+      <w:pPr>
+        <w:rPr>
+          <w:sz w:val="2"/>
+        </w:rPr>
+      </w:pPr>
+      <w:r>
+        <w:t xml:space="preserve">[[/reporting]]</w:t>
       </w:r>
     </w:p>
     <w:p>
@@ -9134,14 +8899,16 @@
     </w:p>
     <w:p>
       <w:pPr>
-        <w:spacing w:line="240" w:lineRule="auto"/>
-        <w:rPr>
-          <w:sz w:val="20"/>
-        </w:rPr>
-      </w:pPr>
-      <w:r>
-        <w:rPr>
-          <w:sz w:val="20"/>
+        <w:spacing w:after="0" w:line="240" w:lineRule="auto"/>
+        <w:rPr>
+          <w:rFonts w:ascii="Consolas" w:hAnsi="Consolas" w:cs="Consolas"/>
+          <w:sz w:val="16"/>
+        </w:rPr>
+      </w:pPr>
+      <w:r>
+        <w:rPr>
+          <w:rFonts w:ascii="Consolas" w:hAnsi="Consolas" w:cs="Consolas"/>
+          <w:sz w:val="16"/>
         </w:rPr>
         <w:t xml:space="preserve">[[folderStructure]]</w:t>
       </w:r>
@@ -9181,7 +8948,22 @@
     </w:p>
     <w:p>
       <w:pPr>
-        <w:spacing w:line="240" w:lineRule="auto"/>
+        <w:rPr>
+          <w:sz w:val="2"/>
+        </w:rPr>
+      </w:pPr>
+      <w:r>
+        <w:t xml:space="preserve">[[#processRuns]]</w:t>
+      </w:r>
+    </w:p>
+    <w:p>
+      <w:pPr>
+        <w:pStyle w:val="ListParagraph"/>
+        <w:numPr>
+          <w:ilvl w:val="0"/>
+          <w:numId w:val="1"/>
+        </w:numPr>
+        <w:spacing w:after="40" w:line="240" w:lineRule="auto"/>
         <w:rPr>
           <w:sz w:val="20"/>
         </w:rPr>
@@ -9190,7 +8972,17 @@
         <w:rPr>
           <w:sz w:val="20"/>
         </w:rPr>
-        <w:t xml:space="preserve">[[processRuns]]</w:t>
+        <w:t xml:space="preserve">[[.]]</w:t>
+      </w:r>
+    </w:p>
+    <w:p>
+      <w:pPr>
+        <w:rPr>
+          <w:sz w:val="2"/>
+        </w:rPr>
+      </w:pPr>
+      <w:r>
+        <w:t xml:space="preserve">[[/processRuns]]</w:t>
       </w:r>
     </w:p>
     <w:p>
@@ -9208,25 +9000,25 @@
         <w:t/>
       </w:r>
       <w:r>
-        <w:t xml:space="preserve">Lists out all </w:t>
-      </w:r>
-      <w:r>
-        <w:t>exceptions {Business/System}</w:t>
-      </w:r>
-      <w:r>
-        <w:t xml:space="preserve"> and the </w:t>
-      </w:r>
-      <w:r>
-        <w:t xml:space="preserve">Bot behavior </w:t>
-      </w:r>
-      <w:r>
-        <w:t xml:space="preserve">for each. </w:t>
-      </w:r>
-      <w:r>
-        <w:t xml:space="preserve">Notifications that are sent, reports generated and other </w:t>
-      </w:r>
-      <w:r>
-        <w:t>requirement specific Bot actions to be listed against each exception type</w:t>
+        <w:t xml:space="preserve"/>
+      </w:r>
+      <w:r>
+        <w:t/>
+      </w:r>
+      <w:r>
+        <w:t xml:space="preserve"/>
+      </w:r>
+      <w:r>
+        <w:t xml:space="preserve"/>
+      </w:r>
+      <w:r>
+        <w:t xml:space="preserve"/>
+      </w:r>
+      <w:r>
+        <w:t xml:space="preserve"/>
+      </w:r>
+      <w:r>
+        <w:t/>
       </w:r>
       <w:r>
         <w:t/>
@@ -9637,7 +9429,22 @@
     </w:p>
     <w:p>
       <w:pPr>
-        <w:spacing w:line="240" w:lineRule="auto"/>
+        <w:rPr>
+          <w:sz w:val="2"/>
+        </w:rPr>
+      </w:pPr>
+      <w:r>
+        <w:t xml:space="preserve">[[#debuggingTips]]</w:t>
+      </w:r>
+    </w:p>
+    <w:p>
+      <w:pPr>
+        <w:pStyle w:val="ListParagraph"/>
+        <w:numPr>
+          <w:ilvl w:val="0"/>
+          <w:numId w:val="1"/>
+        </w:numPr>
+        <w:spacing w:after="40" w:line="240" w:lineRule="auto"/>
         <w:rPr>
           <w:sz w:val="20"/>
         </w:rPr>
@@ -9646,7 +9453,17 @@
         <w:rPr>
           <w:sz w:val="20"/>
         </w:rPr>
-        <w:t xml:space="preserve">[[debuggingTips]]</w:t>
+        <w:t xml:space="preserve">[[.]]</w:t>
+      </w:r>
+    </w:p>
+    <w:p>
+      <w:pPr>
+        <w:rPr>
+          <w:sz w:val="2"/>
+        </w:rPr>
+      </w:pPr>
+      <w:r>
+        <w:t xml:space="preserve">[[/debuggingTips]]</w:t>
       </w:r>
     </w:p>
     <w:p>
@@ -9664,7 +9481,22 @@
     </w:p>
     <w:p>
       <w:pPr>
-        <w:spacing w:line="240" w:lineRule="auto"/>
+        <w:rPr>
+          <w:sz w:val="2"/>
+        </w:rPr>
+      </w:pPr>
+      <w:r>
+        <w:t xml:space="preserve">[[#optimizations]]</w:t>
+      </w:r>
+    </w:p>
+    <w:p>
+      <w:pPr>
+        <w:pStyle w:val="ListParagraph"/>
+        <w:numPr>
+          <w:ilvl w:val="0"/>
+          <w:numId w:val="1"/>
+        </w:numPr>
+        <w:spacing w:after="40" w:line="240" w:lineRule="auto"/>
         <w:rPr>
           <w:sz w:val="20"/>
         </w:rPr>
@@ -9673,7 +9505,17 @@
         <w:rPr>
           <w:sz w:val="20"/>
         </w:rPr>
-        <w:t xml:space="preserve">[[optimizations]]</w:t>
+        <w:t xml:space="preserve">[[.]]</w:t>
+      </w:r>
+    </w:p>
+    <w:p>
+      <w:pPr>
+        <w:rPr>
+          <w:sz w:val="2"/>
+        </w:rPr>
+      </w:pPr>
+      <w:r>
+        <w:t xml:space="preserve">[[/optimizations]]</w:t>
       </w:r>
     </w:p>
     <w:p>
@@ -9688,7 +9530,22 @@
     </w:p>
     <w:p>
       <w:pPr>
-        <w:spacing w:line="240" w:lineRule="auto"/>
+        <w:rPr>
+          <w:sz w:val="2"/>
+        </w:rPr>
+      </w:pPr>
+      <w:r>
+        <w:t xml:space="preserve">[[#codeReview]]</w:t>
+      </w:r>
+    </w:p>
+    <w:p>
+      <w:pPr>
+        <w:pStyle w:val="ListParagraph"/>
+        <w:numPr>
+          <w:ilvl w:val="0"/>
+          <w:numId w:val="1"/>
+        </w:numPr>
+        <w:spacing w:after="40" w:line="240" w:lineRule="auto"/>
         <w:rPr>
           <w:sz w:val="20"/>
         </w:rPr>
@@ -9697,7 +9554,17 @@
         <w:rPr>
           <w:sz w:val="20"/>
         </w:rPr>
-        <w:t xml:space="preserve">[[codeReview]]</w:t>
+        <w:t xml:space="preserve">[[.]]</w:t>
+      </w:r>
+    </w:p>
+    <w:p>
+      <w:pPr>
+        <w:rPr>
+          <w:sz w:val="2"/>
+        </w:rPr>
+      </w:pPr>
+      <w:r>
+        <w:t xml:space="preserve">[[/codeReview]]</w:t>
       </w:r>
     </w:p>
     <w:p>
@@ -10078,7 +9945,22 @@
     </w:p>
     <w:p>
       <w:pPr>
-        <w:spacing w:line="240" w:lineRule="auto"/>
+        <w:rPr>
+          <w:sz w:val="2"/>
+        </w:rPr>
+      </w:pPr>
+      <w:r>
+        <w:t xml:space="preserve">[[#dataSecurity]]</w:t>
+      </w:r>
+    </w:p>
+    <w:p>
+      <w:pPr>
+        <w:pStyle w:val="ListParagraph"/>
+        <w:numPr>
+          <w:ilvl w:val="0"/>
+          <w:numId w:val="1"/>
+        </w:numPr>
+        <w:spacing w:after="40" w:line="240" w:lineRule="auto"/>
         <w:rPr>
           <w:sz w:val="20"/>
         </w:rPr>
@@ -10087,7 +9969,17 @@
         <w:rPr>
           <w:sz w:val="20"/>
         </w:rPr>
-        <w:t xml:space="preserve">[[dataSecurity]]</w:t>
+        <w:t xml:space="preserve">[[.]]</w:t>
+      </w:r>
+    </w:p>
+    <w:p>
+      <w:pPr>
+        <w:rPr>
+          <w:sz w:val="2"/>
+        </w:rPr>
+      </w:pPr>
+      <w:r>
+        <w:t xml:space="preserve">[[/dataSecurity]]</w:t>
       </w:r>
     </w:p>
     <w:p>
@@ -10123,168 +10015,161 @@
         <w:rPr>
           <w:rFonts w:eastAsia="Arial Unicode MS"/>
         </w:rPr>
-        <w:t xml:space="preserve"> for APIs being used</w:t>
-      </w:r>
-      <w:r>
-        <w:rPr>
-          <w:rFonts w:eastAsia="Arial Unicode MS"/>
-        </w:rPr>
-        <w:t>, TDD, DSD</w:t>
-      </w:r>
+        <w:t xml:space="preserve"/>
+      </w:r>
+      <w:r>
+        <w:rPr>
+          <w:rFonts w:eastAsia="Arial Unicode MS"/>
+        </w:rPr>
+        <w:t/>
+      </w:r>
+      <w:r>
+        <w:rPr>
+          <w:rFonts w:eastAsia="Arial Unicode MS"/>
+        </w:rPr>
+        <w:t xml:space="preserve"/>
+      </w:r>
+      <w:r>
+        <w:rPr>
+          <w:rFonts w:eastAsia="Arial Unicode MS"/>
+        </w:rPr>
+        <w:t/>
+      </w:r>
+      <w:r>
+        <w:rPr>
+          <w:rFonts w:eastAsia="Arial Unicode MS"/>
+        </w:rPr>
+        <w:t xml:space="preserve"/>
+      </w:r>
+      <w:proofErr w:type="gramStart"/>
+      <w:r>
+        <w:rPr>
+          <w:rFonts w:eastAsia="Arial Unicode MS"/>
+        </w:rPr>
+        <w:t/>
+      </w:r>
+      <w:proofErr w:type="gramEnd"/>
+      <w:r>
+        <w:rPr>
+          <w:rFonts w:eastAsia="Arial Unicode MS"/>
+        </w:rPr>
+        <w:t xml:space="preserve"/>
+      </w:r>
+      <w:r>
+        <w:rPr>
+          <w:rFonts w:eastAsia="Arial Unicode MS"/>
+        </w:rPr>
+        <w:t xml:space="preserve"/>
+      </w:r>
+      <w:r>
+        <w:rPr>
+          <w:rFonts w:eastAsia="Arial Unicode MS"/>
+        </w:rPr>
+        <w:t/>
+      </w:r>
+      <w:r>
+        <w:rPr>
+          <w:rFonts w:eastAsia="Arial Unicode MS"/>
+        </w:rPr>
+        <w:t xml:space="preserve"/>
+      </w:r>
+    </w:p>
+    <w:p>
+      <w:pPr>
+        <w:rPr>
+          <w:rFonts w:eastAsia="Arial Unicode MS"/>
+        </w:rPr>
+      </w:pPr>
+    </w:p>
+    <w:p>
+      <w:pPr>
+        <w:rPr>
+          <w:rFonts w:eastAsia="Arial Unicode MS"/>
+        </w:rPr>
+      </w:pPr>
+      <w:r>
+        <w:rPr>
+          <w:rFonts w:eastAsia="Arial Unicode MS"/>
+        </w:rPr>
+        <w:t xml:space="preserve"/>
+      </w:r>
+      <w:r>
+        <w:rPr>
+          <w:rFonts w:eastAsia="Arial Unicode MS"/>
+        </w:rPr>
+        <w:t>is embedded below to import and use</w:t>
+      </w:r>
+      <w:r>
+        <w:rPr>
+          <w:rFonts w:eastAsia="Arial Unicode MS"/>
+        </w:rPr>
+        <w:t xml:space="preserve"> in </w:t>
+      </w:r>
+      <w:proofErr w:type="spellStart"/>
+      <w:r>
+        <w:rPr>
+          <w:rFonts w:eastAsia="Arial Unicode MS"/>
+        </w:rPr>
+        <w:t>app.diagrms</w:t>
+      </w:r>
+      <w:proofErr w:type="spellEnd"/>
+      <w:r>
+        <w:rPr>
+          <w:rFonts w:eastAsia="Arial Unicode MS"/>
+        </w:rPr>
+        <w:t>/</w:t>
+      </w:r>
+      <w:proofErr w:type="spellStart"/>
+      <w:r>
+        <w:rPr>
+          <w:rFonts w:eastAsia="Arial Unicode MS"/>
+        </w:rPr>
+        <w:t>lucidchart</w:t>
+      </w:r>
+      <w:proofErr w:type="spellEnd"/>
+      <w:r>
+        <w:rPr>
+          <w:rFonts w:eastAsia="Arial Unicode MS"/>
+        </w:rPr>
+        <w:t>/</w:t>
+      </w:r>
+      <w:proofErr w:type="spellStart"/>
+      <w:r>
+        <w:rPr>
+          <w:rFonts w:eastAsia="Arial Unicode MS"/>
+        </w:rPr>
+        <w:t>visio</w:t>
+      </w:r>
+      <w:proofErr w:type="spellEnd"/>
       <w:r>
         <w:rPr>
           <w:rFonts w:eastAsia="Arial Unicode MS"/>
         </w:rPr>
         <w:t xml:space="preserve"> </w:t>
       </w:r>
-      <w:r>
-        <w:rPr>
-          <w:rFonts w:eastAsia="Arial Unicode MS"/>
-        </w:rPr>
-        <w:t>etc.</w:t>
-      </w:r>
-      <w:r>
-        <w:rPr>
-          <w:rFonts w:eastAsia="Arial Unicode MS"/>
-        </w:rPr>
-        <w:t xml:space="preserve"> that </w:t>
-      </w:r>
-      <w:proofErr w:type="gramStart"/>
-      <w:r>
-        <w:rPr>
-          <w:rFonts w:eastAsia="Arial Unicode MS"/>
-        </w:rPr>
-        <w:t>is</w:t>
-      </w:r>
-      <w:proofErr w:type="gramEnd"/>
-      <w:r>
-        <w:rPr>
-          <w:rFonts w:eastAsia="Arial Unicode MS"/>
-        </w:rPr>
-        <w:t xml:space="preserve"> linked to the Process and Technical design </w:t>
-      </w:r>
-      <w:r>
-        <w:rPr>
-          <w:rFonts w:eastAsia="Arial Unicode MS"/>
-        </w:rPr>
-        <w:t xml:space="preserve">for better understanding and </w:t>
-      </w:r>
-      <w:r>
-        <w:rPr>
-          <w:rFonts w:eastAsia="Arial Unicode MS"/>
-        </w:rPr>
-        <w:t>record keeping</w:t>
-      </w:r>
-      <w:r>
-        <w:rPr>
-          <w:rFonts w:eastAsia="Arial Unicode MS"/>
-        </w:rPr>
-        <w:t xml:space="preserve"/>
-      </w:r>
-    </w:p>
-    <w:p>
-      <w:pPr>
-        <w:rPr>
-          <w:rFonts w:eastAsia="Arial Unicode MS"/>
-        </w:rPr>
-      </w:pPr>
-    </w:p>
-    <w:p>
-      <w:pPr>
-        <w:rPr>
-          <w:rFonts w:eastAsia="Arial Unicode MS"/>
-        </w:rPr>
-      </w:pPr>
-      <w:r>
-        <w:rPr>
-          <w:rFonts w:eastAsia="Arial Unicode MS"/>
-        </w:rPr>
-        <w:t xml:space="preserve"/>
-      </w:r>
-      <w:r>
-        <w:rPr>
-          <w:rFonts w:eastAsia="Arial Unicode MS"/>
-        </w:rPr>
-        <w:t>is embedded below to import and use</w:t>
-      </w:r>
-      <w:r>
-        <w:rPr>
-          <w:rFonts w:eastAsia="Arial Unicode MS"/>
-        </w:rPr>
-        <w:t xml:space="preserve"> in </w:t>
-      </w:r>
       <w:proofErr w:type="spellStart"/>
       <w:r>
         <w:rPr>
           <w:rFonts w:eastAsia="Arial Unicode MS"/>
         </w:rPr>
-        <w:t>app.diagrms</w:t>
+        <w:t>etc</w:t>
       </w:r>
       <w:proofErr w:type="spellEnd"/>
-      <w:r>
-        <w:rPr>
-          <w:rFonts w:eastAsia="Arial Unicode MS"/>
-        </w:rPr>
-        <w:t>/</w:t>
-      </w:r>
-      <w:proofErr w:type="spellStart"/>
-      <w:r>
-        <w:rPr>
-          <w:rFonts w:eastAsia="Arial Unicode MS"/>
-        </w:rPr>
-        <w:t>lucidchart</w:t>
-      </w:r>
-      <w:proofErr w:type="spellEnd"/>
-      <w:r>
-        <w:rPr>
-          <w:rFonts w:eastAsia="Arial Unicode MS"/>
-        </w:rPr>
-        <w:t>/</w:t>
-      </w:r>
-      <w:proofErr w:type="spellStart"/>
-      <w:r>
-        <w:rPr>
-          <w:rFonts w:eastAsia="Arial Unicode MS"/>
-        </w:rPr>
-        <w:t>visio</w:t>
-      </w:r>
-      <w:proofErr w:type="spellEnd"/>
-      <w:r>
-        <w:rPr>
-          <w:rFonts w:eastAsia="Arial Unicode MS"/>
-        </w:rPr>
-        <w:t xml:space="preserve"> </w:t>
-      </w:r>
-      <w:proofErr w:type="spellStart"/>
-      <w:r>
-        <w:rPr>
-          <w:rFonts w:eastAsia="Arial Unicode MS"/>
-        </w:rPr>
-        <w:t>etc</w:t>
-      </w:r>
-      <w:proofErr w:type="spellEnd"/>
-    </w:p>
-    <w:p>
-      <w:pPr>
-        <w:rPr>
-          <w:rFonts w:eastAsia="Arial Unicode MS"/>
-        </w:rPr>
-      </w:pPr>
-    </w:p>
-    <w:p>
-      <w:pPr>
-        <w:rPr>
-          <w:rFonts w:eastAsia="Arial Unicode MS"/>
-        </w:rPr>
-      </w:pPr>
-      <w:r>
-        <w:object w:dxaOrig="1541" w:dyaOrig="998" w14:anchorId="38930084">
-          <v:shape id="_x0000_i1029" type="#_x0000_t75" style="width:77.25pt;height:50.25pt" o:ole="">
-            <v:imagedata r:id="rId21" o:title=""/>
-          </v:shape>
-          <o:OLEObject Type="Embed" ProgID="Visio.Drawing.15" ShapeID="_x0000_i1029" DrawAspect="Icon" ObjectID="_1814626463" r:id="rId22"/>
-        </w:object>
-      </w:r>
+    </w:p>
+    <w:p>
+      <w:pPr>
+        <w:rPr>
+          <w:rFonts w:eastAsia="Arial Unicode MS"/>
+        </w:rPr>
+      </w:pPr>
+    </w:p>
+    <w:p>
+      <w:pPr>
+        <w:rPr>
+          <w:rFonts w:eastAsia="Arial Unicode MS"/>
+        </w:rPr>
+      </w:pPr>
+      <w:r/>
     </w:p>
     <w:p>
       <w:pPr>

</xml_diff>

<commit_message>
SDD: dependency/asset tables, bullet lists, layout-aware process diagram
- Dependencies, External libraries and Orchestrator assets now render as bordered tables (Package/Version/Purpose, Asset/Details) instead of bullet loops.
- Replace numbered <w:numPr> list items with literal bullet points across all SDD prose lists (template numId 1 was a decimal list).
- Detect entry-workflow layout (statemachine/flowchart/sequence) in the UiPath parser; draw the REFramework state machine for state machines, a branch-aware flow for flowcharts, and the high-level business flow for sequences.

Co-Authored-By: Claude Opus 4.8 <noreply@anthropic.com>
</commit_message>
<xml_diff>
--- a/node_modules/@instadocs/core/assets/sdd-template.docx
+++ b/node_modules/@instadocs/core/assets/sdd-template.docx
@@ -5639,15 +5639,18 @@
     </w:p>
     <w:p>
       <w:pPr>
-        <w:pStyle w:val="ListParagraph"/>
-        <w:numPr>
-          <w:ilvl w:val="0"/>
-          <w:numId w:val="1"/>
-        </w:numPr>
+        <w:ind w:left="360" w:hanging="240"/>
+        <w:spacing w:after="40" w:line="240" w:lineRule="auto"/>
         <w:rPr>
           <w:sz w:val="20"/>
         </w:rPr>
       </w:pPr>
+      <w:r>
+        <w:rPr>
+          <w:sz w:val="20"/>
+        </w:rPr>
+        <w:t xml:space="preserve">•  </w:t>
+      </w:r>
       <w:r>
         <w:rPr>
           <w:b/>
@@ -7709,16 +7712,18 @@
     </w:p>
     <w:p>
       <w:pPr>
-        <w:pStyle w:val="ListParagraph"/>
-        <w:numPr>
-          <w:ilvl w:val="0"/>
-          <w:numId w:val="1"/>
-        </w:numPr>
+        <w:ind w:left="360" w:hanging="240"/>
         <w:spacing w:after="40" w:line="240" w:lineRule="auto"/>
         <w:rPr>
           <w:sz w:val="20"/>
         </w:rPr>
       </w:pPr>
+      <w:r>
+        <w:rPr>
+          <w:sz w:val="20"/>
+        </w:rPr>
+        <w:t xml:space="preserve">•  </w:t>
+      </w:r>
       <w:r>
         <w:rPr>
           <w:sz w:val="20"/>
@@ -7771,50 +7776,117 @@
       </w:r>
       <w:bookmarkEnd w:id="23"/>
     </w:p>
-    <w:p>
-      <w:pPr>
-        <w:rPr>
-          <w:sz w:val="2"/>
-        </w:rPr>
-      </w:pPr>
-      <w:r>
-        <w:t xml:space="preserve">[[#orchestratorAssets]]</w:t>
-      </w:r>
-    </w:p>
-    <w:p>
-      <w:pPr>
-        <w:pStyle w:val="ListParagraph"/>
-        <w:numPr>
-          <w:ilvl w:val="0"/>
-          <w:numId w:val="1"/>
-        </w:numPr>
-        <w:rPr>
-          <w:sz w:val="20"/>
-        </w:rPr>
-      </w:pPr>
-      <w:r>
-        <w:rPr>
-          <w:b/>
-          <w:sz w:val="20"/>
-        </w:rPr>
-        <w:t xml:space="preserve">[[item]]</w:t>
-      </w:r>
-      <w:r>
-        <w:rPr>
-          <w:sz w:val="20"/>
-        </w:rPr>
-        <w:t xml:space="preserve">: [[desc]]</w:t>
-      </w:r>
-    </w:p>
-    <w:p>
-      <w:pPr>
-        <w:rPr>
-          <w:sz w:val="2"/>
-        </w:rPr>
-      </w:pPr>
-      <w:r>
-        <w:t xml:space="preserve">[[/orchestratorAssets]]</w:t>
-      </w:r>
+    <w:tbl>
+      <w:tblPr>
+        <w:tblW w:w="9200" w:type="dxa"/>
+        <w:tblBorders>
+          <w:top w:val="single" w:sz="4" w:space="0" w:color="BFBFBF"/>
+          <w:left w:val="single" w:sz="4" w:space="0" w:color="BFBFBF"/>
+          <w:bottom w:val="single" w:sz="4" w:space="0" w:color="BFBFBF"/>
+          <w:right w:val="single" w:sz="4" w:space="0" w:color="BFBFBF"/>
+          <w:insideH w:val="single" w:sz="4" w:space="0" w:color="BFBFBF"/>
+          <w:insideV w:val="single" w:sz="4" w:space="0" w:color="BFBFBF"/>
+        </w:tblBorders>
+        <w:tblLayout w:type="fixed"/>
+      </w:tblPr>
+      <w:tblGrid>
+        <w:gridCol w:w="3200"/>
+        <w:gridCol w:w="6000"/>
+      </w:tblGrid>
+      <w:tr>
+        <w:tc>
+          <w:tcPr>
+            <w:tcW w:w="3200" w:type="dxa"/>
+            <w:shd w:val="clear" w:color="auto" w:fill="D9E1F2"/>
+          </w:tcPr>
+          <w:p>
+            <w:pPr>
+              <w:spacing w:line="240" w:lineRule="auto"/>
+              <w:rPr>
+                <w:b/>
+                <w:sz w:val="18"/>
+              </w:rPr>
+            </w:pPr>
+            <w:r>
+              <w:rPr>
+                <w:b/>
+                <w:sz w:val="18"/>
+              </w:rPr>
+              <w:t xml:space="preserve">Asset</w:t>
+            </w:r>
+          </w:p>
+        </w:tc>
+        <w:tc>
+          <w:tcPr>
+            <w:tcW w:w="6000" w:type="dxa"/>
+            <w:shd w:val="clear" w:color="auto" w:fill="D9E1F2"/>
+          </w:tcPr>
+          <w:p>
+            <w:pPr>
+              <w:spacing w:line="240" w:lineRule="auto"/>
+              <w:rPr>
+                <w:b/>
+                <w:sz w:val="18"/>
+              </w:rPr>
+            </w:pPr>
+            <w:r>
+              <w:rPr>
+                <w:b/>
+                <w:sz w:val="18"/>
+              </w:rPr>
+              <w:t xml:space="preserve">Type / Details</w:t>
+            </w:r>
+          </w:p>
+        </w:tc>
+      </w:tr>
+      <w:tr>
+        <w:tc>
+          <w:tcPr>
+            <w:tcW w:w="3200" w:type="dxa"/>
+          </w:tcPr>
+          <w:p>
+            <w:pPr>
+              <w:spacing w:line="240" w:lineRule="auto"/>
+              <w:rPr>
+                <w:sz w:val="18"/>
+              </w:rPr>
+            </w:pPr>
+            <w:r>
+              <w:rPr>
+                <w:sz w:val="18"/>
+              </w:rPr>
+              <w:t xml:space="preserve">[[#orchestratorAssets]][[item]]</w:t>
+            </w:r>
+          </w:p>
+        </w:tc>
+        <w:tc>
+          <w:tcPr>
+            <w:tcW w:w="6000" w:type="dxa"/>
+          </w:tcPr>
+          <w:p>
+            <w:pPr>
+              <w:spacing w:line="240" w:lineRule="auto"/>
+              <w:rPr>
+                <w:sz w:val="18"/>
+              </w:rPr>
+            </w:pPr>
+            <w:r>
+              <w:rPr>
+                <w:sz w:val="18"/>
+              </w:rPr>
+              <w:t xml:space="preserve">[[desc]][[/orchestratorAssets]]</w:t>
+            </w:r>
+          </w:p>
+        </w:tc>
+      </w:tr>
+    </w:tbl>
+    <w:p>
+      <w:pPr>
+        <w:spacing w:after="0"/>
+        <w:rPr>
+          <w:sz w:val="4"/>
+        </w:rPr>
+      </w:pPr>
     </w:p>
     <w:p>
       <w:pPr>
@@ -8194,11 +8266,7 @@
     </w:p>
     <w:p>
       <w:pPr>
-        <w:pStyle w:val="ListParagraph"/>
-        <w:numPr>
-          <w:ilvl w:val="0"/>
-          <w:numId w:val="1"/>
-        </w:numPr>
+        <w:ind w:left="360" w:hanging="240"/>
         <w:spacing w:after="40" w:line="240" w:lineRule="auto"/>
         <w:rPr>
           <w:sz w:val="20"/>
@@ -8208,6 +8276,12 @@
         <w:rPr>
           <w:sz w:val="20"/>
         </w:rPr>
+        <w:t xml:space="preserve">•  </w:t>
+      </w:r>
+      <w:r>
+        <w:rPr>
+          <w:sz w:val="20"/>
+        </w:rPr>
         <w:t xml:space="preserve">[[.]]</w:t>
       </w:r>
     </w:p>
@@ -8243,15 +8317,18 @@
     </w:p>
     <w:p>
       <w:pPr>
-        <w:pStyle w:val="ListParagraph"/>
-        <w:numPr>
-          <w:ilvl w:val="0"/>
-          <w:numId w:val="1"/>
-        </w:numPr>
+        <w:ind w:left="360" w:hanging="240"/>
+        <w:spacing w:after="40" w:line="240" w:lineRule="auto"/>
         <w:rPr>
           <w:sz w:val="20"/>
         </w:rPr>
       </w:pPr>
+      <w:r>
+        <w:rPr>
+          <w:sz w:val="20"/>
+        </w:rPr>
+        <w:t xml:space="preserve">•  </w:t>
+      </w:r>
       <w:r>
         <w:rPr>
           <w:b/>
@@ -8860,16 +8937,18 @@
     </w:p>
     <w:p>
       <w:pPr>
-        <w:pStyle w:val="ListParagraph"/>
-        <w:numPr>
-          <w:ilvl w:val="0"/>
-          <w:numId w:val="1"/>
-        </w:numPr>
+        <w:ind w:left="360" w:hanging="240"/>
         <w:spacing w:after="40" w:line="240" w:lineRule="auto"/>
         <w:rPr>
           <w:sz w:val="20"/>
         </w:rPr>
       </w:pPr>
+      <w:r>
+        <w:rPr>
+          <w:sz w:val="20"/>
+        </w:rPr>
+        <w:t xml:space="preserve">•  </w:t>
+      </w:r>
       <w:r>
         <w:rPr>
           <w:sz w:val="20"/>
@@ -8958,16 +9037,18 @@
     </w:p>
     <w:p>
       <w:pPr>
-        <w:pStyle w:val="ListParagraph"/>
-        <w:numPr>
-          <w:ilvl w:val="0"/>
-          <w:numId w:val="1"/>
-        </w:numPr>
+        <w:ind w:left="360" w:hanging="240"/>
         <w:spacing w:after="40" w:line="240" w:lineRule="auto"/>
         <w:rPr>
           <w:sz w:val="20"/>
         </w:rPr>
       </w:pPr>
+      <w:r>
+        <w:rPr>
+          <w:sz w:val="20"/>
+        </w:rPr>
+        <w:t xml:space="preserve">•  </w:t>
+      </w:r>
       <w:r>
         <w:rPr>
           <w:sz w:val="20"/>
@@ -9439,11 +9520,7 @@
     </w:p>
     <w:p>
       <w:pPr>
-        <w:pStyle w:val="ListParagraph"/>
-        <w:numPr>
-          <w:ilvl w:val="0"/>
-          <w:numId w:val="1"/>
-        </w:numPr>
+        <w:ind w:left="360" w:hanging="240"/>
         <w:spacing w:after="40" w:line="240" w:lineRule="auto"/>
         <w:rPr>
           <w:sz w:val="20"/>
@@ -9453,6 +9530,12 @@
         <w:rPr>
           <w:sz w:val="20"/>
         </w:rPr>
+        <w:t xml:space="preserve">•  </w:t>
+      </w:r>
+      <w:r>
+        <w:rPr>
+          <w:sz w:val="20"/>
+        </w:rPr>
         <w:t xml:space="preserve">[[.]]</w:t>
       </w:r>
     </w:p>
@@ -9491,11 +9574,7 @@
     </w:p>
     <w:p>
       <w:pPr>
-        <w:pStyle w:val="ListParagraph"/>
-        <w:numPr>
-          <w:ilvl w:val="0"/>
-          <w:numId w:val="1"/>
-        </w:numPr>
+        <w:ind w:left="360" w:hanging="240"/>
         <w:spacing w:after="40" w:line="240" w:lineRule="auto"/>
         <w:rPr>
           <w:sz w:val="20"/>
@@ -9505,6 +9584,12 @@
         <w:rPr>
           <w:sz w:val="20"/>
         </w:rPr>
+        <w:t xml:space="preserve">•  </w:t>
+      </w:r>
+      <w:r>
+        <w:rPr>
+          <w:sz w:val="20"/>
+        </w:rPr>
         <w:t xml:space="preserve">[[.]]</w:t>
       </w:r>
     </w:p>
@@ -9540,11 +9625,7 @@
     </w:p>
     <w:p>
       <w:pPr>
-        <w:pStyle w:val="ListParagraph"/>
-        <w:numPr>
-          <w:ilvl w:val="0"/>
-          <w:numId w:val="1"/>
-        </w:numPr>
+        <w:ind w:left="360" w:hanging="240"/>
         <w:spacing w:after="40" w:line="240" w:lineRule="auto"/>
         <w:rPr>
           <w:sz w:val="20"/>
@@ -9554,6 +9635,12 @@
         <w:rPr>
           <w:sz w:val="20"/>
         </w:rPr>
+        <w:t xml:space="preserve">•  </w:t>
+      </w:r>
+      <w:r>
+        <w:rPr>
+          <w:sz w:val="20"/>
+        </w:rPr>
         <w:t xml:space="preserve">[[.]]</w:t>
       </w:r>
     </w:p>
@@ -9577,50 +9664,159 @@
       </w:r>
       <w:bookmarkEnd w:id="38"/>
     </w:p>
-    <w:p>
-      <w:pPr>
-        <w:rPr>
-          <w:sz w:val="2"/>
-        </w:rPr>
-      </w:pPr>
-      <w:r>
-        <w:t xml:space="preserve">[[#dependencies]]</w:t>
-      </w:r>
-    </w:p>
-    <w:p>
-      <w:pPr>
-        <w:pStyle w:val="ListParagraph"/>
-        <w:numPr>
-          <w:ilvl w:val="0"/>
-          <w:numId w:val="1"/>
-        </w:numPr>
-        <w:rPr>
-          <w:sz w:val="20"/>
-        </w:rPr>
-      </w:pPr>
-      <w:r>
-        <w:rPr>
-          <w:b/>
-          <w:sz w:val="20"/>
-        </w:rPr>
-        <w:t xml:space="preserve">[[name]][[version]]</w:t>
-      </w:r>
-      <w:r>
-        <w:rPr>
-          <w:sz w:val="20"/>
-        </w:rPr>
-        <w:t xml:space="preserve">: [[purpose]]</w:t>
-      </w:r>
-    </w:p>
-    <w:p>
-      <w:pPr>
-        <w:rPr>
-          <w:sz w:val="2"/>
-        </w:rPr>
-      </w:pPr>
-      <w:r>
-        <w:t xml:space="preserve">[[/dependencies]]</w:t>
-      </w:r>
+    <w:tbl>
+      <w:tblPr>
+        <w:tblW w:w="9200" w:type="dxa"/>
+        <w:tblBorders>
+          <w:top w:val="single" w:sz="4" w:space="0" w:color="BFBFBF"/>
+          <w:left w:val="single" w:sz="4" w:space="0" w:color="BFBFBF"/>
+          <w:bottom w:val="single" w:sz="4" w:space="0" w:color="BFBFBF"/>
+          <w:right w:val="single" w:sz="4" w:space="0" w:color="BFBFBF"/>
+          <w:insideH w:val="single" w:sz="4" w:space="0" w:color="BFBFBF"/>
+          <w:insideV w:val="single" w:sz="4" w:space="0" w:color="BFBFBF"/>
+        </w:tblBorders>
+        <w:tblLayout w:type="fixed"/>
+      </w:tblPr>
+      <w:tblGrid>
+        <w:gridCol w:w="3400"/>
+        <w:gridCol w:w="1400"/>
+        <w:gridCol w:w="4400"/>
+      </w:tblGrid>
+      <w:tr>
+        <w:tc>
+          <w:tcPr>
+            <w:tcW w:w="3400" w:type="dxa"/>
+            <w:shd w:val="clear" w:color="auto" w:fill="D9E1F2"/>
+          </w:tcPr>
+          <w:p>
+            <w:pPr>
+              <w:spacing w:line="240" w:lineRule="auto"/>
+              <w:rPr>
+                <w:b/>
+                <w:sz w:val="18"/>
+              </w:rPr>
+            </w:pPr>
+            <w:r>
+              <w:rPr>
+                <w:b/>
+                <w:sz w:val="18"/>
+              </w:rPr>
+              <w:t xml:space="preserve">Package</w:t>
+            </w:r>
+          </w:p>
+        </w:tc>
+        <w:tc>
+          <w:tcPr>
+            <w:tcW w:w="1400" w:type="dxa"/>
+            <w:shd w:val="clear" w:color="auto" w:fill="D9E1F2"/>
+          </w:tcPr>
+          <w:p>
+            <w:pPr>
+              <w:spacing w:line="240" w:lineRule="auto"/>
+              <w:rPr>
+                <w:b/>
+                <w:sz w:val="18"/>
+              </w:rPr>
+            </w:pPr>
+            <w:r>
+              <w:rPr>
+                <w:b/>
+                <w:sz w:val="18"/>
+              </w:rPr>
+              <w:t xml:space="preserve">Version</w:t>
+            </w:r>
+          </w:p>
+        </w:tc>
+        <w:tc>
+          <w:tcPr>
+            <w:tcW w:w="4400" w:type="dxa"/>
+            <w:shd w:val="clear" w:color="auto" w:fill="D9E1F2"/>
+          </w:tcPr>
+          <w:p>
+            <w:pPr>
+              <w:spacing w:line="240" w:lineRule="auto"/>
+              <w:rPr>
+                <w:b/>
+                <w:sz w:val="18"/>
+              </w:rPr>
+            </w:pPr>
+            <w:r>
+              <w:rPr>
+                <w:b/>
+                <w:sz w:val="18"/>
+              </w:rPr>
+              <w:t xml:space="preserve">Purpose</w:t>
+            </w:r>
+          </w:p>
+        </w:tc>
+      </w:tr>
+      <w:tr>
+        <w:tc>
+          <w:tcPr>
+            <w:tcW w:w="3400" w:type="dxa"/>
+          </w:tcPr>
+          <w:p>
+            <w:pPr>
+              <w:spacing w:line="240" w:lineRule="auto"/>
+              <w:rPr>
+                <w:sz w:val="18"/>
+              </w:rPr>
+            </w:pPr>
+            <w:r>
+              <w:rPr>
+                <w:sz w:val="18"/>
+              </w:rPr>
+              <w:t xml:space="preserve">[[#dependencies]][[name]]</w:t>
+            </w:r>
+          </w:p>
+        </w:tc>
+        <w:tc>
+          <w:tcPr>
+            <w:tcW w:w="1400" w:type="dxa"/>
+          </w:tcPr>
+          <w:p>
+            <w:pPr>
+              <w:spacing w:line="240" w:lineRule="auto"/>
+              <w:rPr>
+                <w:sz w:val="18"/>
+              </w:rPr>
+            </w:pPr>
+            <w:r>
+              <w:rPr>
+                <w:sz w:val="18"/>
+              </w:rPr>
+              <w:t xml:space="preserve">[[version]]</w:t>
+            </w:r>
+          </w:p>
+        </w:tc>
+        <w:tc>
+          <w:tcPr>
+            <w:tcW w:w="4400" w:type="dxa"/>
+          </w:tcPr>
+          <w:p>
+            <w:pPr>
+              <w:spacing w:line="240" w:lineRule="auto"/>
+              <w:rPr>
+                <w:sz w:val="18"/>
+              </w:rPr>
+            </w:pPr>
+            <w:r>
+              <w:rPr>
+                <w:sz w:val="18"/>
+              </w:rPr>
+              <w:t xml:space="preserve">[[purpose]][[/dependencies]]</w:t>
+            </w:r>
+          </w:p>
+        </w:tc>
+      </w:tr>
+    </w:tbl>
+    <w:p>
+      <w:pPr>
+        <w:spacing w:after="0"/>
+        <w:rPr>
+          <w:sz w:val="4"/>
+        </w:rPr>
+      </w:pPr>
     </w:p>
     <w:p>
       <w:pPr>
@@ -9633,6 +9829,170 @@
       </w:r>
       <w:bookmarkEnd w:id="39"/>
     </w:p>
+    <w:tbl>
+      <w:tblPr>
+        <w:tblW w:w="9200" w:type="dxa"/>
+        <w:tblBorders>
+          <w:top w:val="single" w:sz="4" w:space="0" w:color="BFBFBF"/>
+          <w:left w:val="single" w:sz="4" w:space="0" w:color="BFBFBF"/>
+          <w:bottom w:val="single" w:sz="4" w:space="0" w:color="BFBFBF"/>
+          <w:right w:val="single" w:sz="4" w:space="0" w:color="BFBFBF"/>
+          <w:insideH w:val="single" w:sz="4" w:space="0" w:color="BFBFBF"/>
+          <w:insideV w:val="single" w:sz="4" w:space="0" w:color="BFBFBF"/>
+        </w:tblBorders>
+        <w:tblLayout w:type="fixed"/>
+      </w:tblPr>
+      <w:tblGrid>
+        <w:gridCol w:w="3400"/>
+        <w:gridCol w:w="1400"/>
+        <w:gridCol w:w="4400"/>
+      </w:tblGrid>
+      <w:tr>
+        <w:tc>
+          <w:tcPr>
+            <w:tcW w:w="3400" w:type="dxa"/>
+            <w:shd w:val="clear" w:color="auto" w:fill="D9E1F2"/>
+          </w:tcPr>
+          <w:p>
+            <w:pPr>
+              <w:spacing w:line="240" w:lineRule="auto"/>
+              <w:rPr>
+                <w:b/>
+                <w:sz w:val="18"/>
+              </w:rPr>
+            </w:pPr>
+            <w:r>
+              <w:rPr>
+                <w:b/>
+                <w:sz w:val="18"/>
+              </w:rPr>
+              <w:t xml:space="preserve">Library</w:t>
+            </w:r>
+          </w:p>
+        </w:tc>
+        <w:tc>
+          <w:tcPr>
+            <w:tcW w:w="1400" w:type="dxa"/>
+            <w:shd w:val="clear" w:color="auto" w:fill="D9E1F2"/>
+          </w:tcPr>
+          <w:p>
+            <w:pPr>
+              <w:spacing w:line="240" w:lineRule="auto"/>
+              <w:rPr>
+                <w:b/>
+                <w:sz w:val="18"/>
+              </w:rPr>
+            </w:pPr>
+            <w:r>
+              <w:rPr>
+                <w:b/>
+                <w:sz w:val="18"/>
+              </w:rPr>
+              <w:t xml:space="preserve">Version</w:t>
+            </w:r>
+          </w:p>
+        </w:tc>
+        <w:tc>
+          <w:tcPr>
+            <w:tcW w:w="4400" w:type="dxa"/>
+            <w:shd w:val="clear" w:color="auto" w:fill="D9E1F2"/>
+          </w:tcPr>
+          <w:p>
+            <w:pPr>
+              <w:spacing w:line="240" w:lineRule="auto"/>
+              <w:rPr>
+                <w:b/>
+                <w:sz w:val="18"/>
+              </w:rPr>
+            </w:pPr>
+            <w:r>
+              <w:rPr>
+                <w:b/>
+                <w:sz w:val="18"/>
+              </w:rPr>
+              <w:t xml:space="preserve">Purpose</w:t>
+            </w:r>
+          </w:p>
+        </w:tc>
+      </w:tr>
+      <w:tr>
+        <w:tc>
+          <w:tcPr>
+            <w:tcW w:w="3400" w:type="dxa"/>
+          </w:tcPr>
+          <w:p>
+            <w:pPr>
+              <w:spacing w:line="240" w:lineRule="auto"/>
+              <w:rPr>
+                <w:sz w:val="18"/>
+              </w:rPr>
+            </w:pPr>
+            <w:r>
+              <w:rPr>
+                <w:sz w:val="18"/>
+              </w:rPr>
+              <w:t xml:space="preserve">[[#externalLibraries]][[name]]</w:t>
+            </w:r>
+          </w:p>
+        </w:tc>
+        <w:tc>
+          <w:tcPr>
+            <w:tcW w:w="1400" w:type="dxa"/>
+          </w:tcPr>
+          <w:p>
+            <w:pPr>
+              <w:spacing w:line="240" w:lineRule="auto"/>
+              <w:rPr>
+                <w:sz w:val="18"/>
+              </w:rPr>
+            </w:pPr>
+            <w:r>
+              <w:rPr>
+                <w:sz w:val="18"/>
+              </w:rPr>
+              <w:t xml:space="preserve">[[version]]</w:t>
+            </w:r>
+          </w:p>
+        </w:tc>
+        <w:tc>
+          <w:tcPr>
+            <w:tcW w:w="4400" w:type="dxa"/>
+          </w:tcPr>
+          <w:p>
+            <w:pPr>
+              <w:spacing w:line="240" w:lineRule="auto"/>
+              <w:rPr>
+                <w:sz w:val="18"/>
+              </w:rPr>
+            </w:pPr>
+            <w:r>
+              <w:rPr>
+                <w:sz w:val="18"/>
+              </w:rPr>
+              <w:t xml:space="preserve">[[purpose]][[/externalLibraries]]</w:t>
+            </w:r>
+          </w:p>
+        </w:tc>
+      </w:tr>
+    </w:tbl>
+    <w:p>
+      <w:pPr>
+        <w:spacing w:after="0"/>
+        <w:rPr>
+          <w:sz w:val="4"/>
+        </w:rPr>
+      </w:pPr>
+    </w:p>
+    <w:p>
+      <w:pPr>
+        <w:pStyle w:val="Heading2"/>
+      </w:pPr>
+      <w:bookmarkStart w:id="40" w:name="_Toc204013722"/>
+      <w:r>
+        <w:t>Future improvements</w:t>
+      </w:r>
+      <w:bookmarkEnd w:id="40"/>
+    </w:p>
     <w:p>
       <w:pPr>
         <w:rPr>
@@ -9640,75 +10000,23 @@
         </w:rPr>
       </w:pPr>
       <w:r>
-        <w:t xml:space="preserve">[[#externalLibraries]]</w:t>
-      </w:r>
-    </w:p>
-    <w:p>
-      <w:pPr>
-        <w:pStyle w:val="ListParagraph"/>
-        <w:numPr>
-          <w:ilvl w:val="0"/>
-          <w:numId w:val="1"/>
-        </w:numPr>
+        <w:t xml:space="preserve">[[#futureImprovements]]</w:t>
+      </w:r>
+    </w:p>
+    <w:p>
+      <w:pPr>
+        <w:ind w:left="360" w:hanging="240"/>
+        <w:spacing w:after="40" w:line="240" w:lineRule="auto"/>
         <w:rPr>
           <w:sz w:val="20"/>
         </w:rPr>
       </w:pPr>
       <w:r>
         <w:rPr>
-          <w:b/>
           <w:sz w:val="20"/>
         </w:rPr>
-        <w:t xml:space="preserve">[[name]][[version]]</w:t>
-      </w:r>
-      <w:r>
-        <w:rPr>
-          <w:sz w:val="20"/>
-        </w:rPr>
-        <w:t xml:space="preserve">: [[purpose]]</w:t>
-      </w:r>
-    </w:p>
-    <w:p>
-      <w:pPr>
-        <w:rPr>
-          <w:sz w:val="2"/>
-        </w:rPr>
-      </w:pPr>
-      <w:r>
-        <w:t xml:space="preserve">[[/externalLibraries]]</w:t>
-      </w:r>
-    </w:p>
-    <w:p>
-      <w:pPr>
-        <w:pStyle w:val="Heading2"/>
-      </w:pPr>
-      <w:bookmarkStart w:id="40" w:name="_Toc204013722"/>
-      <w:r>
-        <w:t>Future improvements</w:t>
-      </w:r>
-      <w:bookmarkEnd w:id="40"/>
-    </w:p>
-    <w:p>
-      <w:pPr>
-        <w:rPr>
-          <w:sz w:val="2"/>
-        </w:rPr>
-      </w:pPr>
-      <w:r>
-        <w:t xml:space="preserve">[[#futureImprovements]]</w:t>
-      </w:r>
-    </w:p>
-    <w:p>
-      <w:pPr>
-        <w:pStyle w:val="ListParagraph"/>
-        <w:numPr>
-          <w:ilvl w:val="0"/>
-          <w:numId w:val="1"/>
-        </w:numPr>
-        <w:rPr>
-          <w:sz w:val="20"/>
-        </w:rPr>
-      </w:pPr>
+        <w:t xml:space="preserve">•  </w:t>
+      </w:r>
       <w:r>
         <w:rPr>
           <w:b/>
@@ -9955,16 +10263,18 @@
     </w:p>
     <w:p>
       <w:pPr>
-        <w:pStyle w:val="ListParagraph"/>
-        <w:numPr>
-          <w:ilvl w:val="0"/>
-          <w:numId w:val="1"/>
-        </w:numPr>
+        <w:ind w:left="360" w:hanging="240"/>
         <w:spacing w:after="40" w:line="240" w:lineRule="auto"/>
         <w:rPr>
           <w:sz w:val="20"/>
         </w:rPr>
       </w:pPr>
+      <w:r>
+        <w:rPr>
+          <w:sz w:val="20"/>
+        </w:rPr>
+        <w:t xml:space="preserve">•  </w:t>
+      </w:r>
       <w:r>
         <w:rPr>
           <w:sz w:val="20"/>
@@ -10492,15 +10802,18 @@
     </w:p>
     <w:p>
       <w:pPr>
-        <w:pStyle w:val="ListParagraph"/>
-        <w:numPr>
-          <w:ilvl w:val="0"/>
-          <w:numId w:val="1"/>
-        </w:numPr>
+        <w:ind w:left="360" w:hanging="240"/>
+        <w:spacing w:after="40" w:line="240" w:lineRule="auto"/>
         <w:rPr>
           <w:sz w:val="20"/>
         </w:rPr>
       </w:pPr>
+      <w:r>
+        <w:rPr>
+          <w:sz w:val="20"/>
+        </w:rPr>
+        <w:t xml:space="preserve">•  </w:t>
+      </w:r>
       <w:r>
         <w:rPr>
           <w:b/>

</xml_diff>

<commit_message>
Per-project REFramework-partitioned high-level flows
- Multi-project (dispatcher/performer): one partitioned flow per project (Init / Get Transaction / Process / End), stacked; no separate per-process section
- Single project: one partitioned diagram (REFramework) or layout-appropriate
- New renderPartitionedFlow/renderPartitionedFlows + bucketSteps heuristic
- Tagger emits a single flow marker; remove dead renderSolutionFlow/renderCombinedHighLevelFlow/highLevelColumn

Co-Authored-By: Claude Opus 4.8 <noreply@anthropic.com>
</commit_message>
<xml_diff>
--- a/node_modules/@instadocs/core/assets/sdd-template.docx
+++ b/node_modules/@instadocs/core/assets/sdd-template.docx
@@ -8881,7 +8881,7 @@
           <w:i/>
           <w:sz w:val="18"/>
         </w:rPr>
-        <w:t xml:space="preserve">High-level process flow:</w:t>
+        <w:t xml:space="preserve">High-level process flow (by REFramework state; one diagram per project):</w:t>
       </w:r>
     </w:p>
     <w:p>
@@ -8890,29 +8890,6 @@
       </w:pPr>
       <w:r>
         <w:t xml:space="preserve">INSTADOCS_FLOWCHART_MAIN</w:t>
-      </w:r>
-    </w:p>
-    <w:p>
-      <w:pPr>
-        <w:rPr>
-          <w:i/>
-          <w:sz w:val="18"/>
-        </w:rPr>
-      </w:pPr>
-      <w:r>
-        <w:rPr>
-          <w:i/>
-          <w:sz w:val="18"/>
-        </w:rPr>
-        <w:t xml:space="preserve">Per-process high-level flows:</w:t>
-      </w:r>
-    </w:p>
-    <w:p>
-      <w:pPr>
-        <w:jc w:val="center"/>
-      </w:pPr>
-      <w:r>
-        <w:t xml:space="preserve">INSTADOCS_FLOWCHART_PROJECTS</w:t>
       </w:r>
     </w:p>
     <w:p>

</xml_diff>